<commit_message>
Add improvements to capital loan agreement
</commit_message>
<xml_diff>
--- a/templates/TEMPLATE_CAPITAL_LOAN_AGREEMENT_Investors.docx
+++ b/templates/TEMPLATE_CAPITAL_LOAN_AGREEMENT_Investors.docx
@@ -594,7 +594,7 @@
         <w:tab/>
       </w:r>
       <w:r>
-        <w:t xml:space="preserve">{{MATURITY_DATE}} </w:t>
+        <w:t>{{MATURITY_DATE}}</w:t>
       </w:r>
       <w:r>
         <w:rPr>
@@ -603,7 +603,13 @@
         <w:t xml:space="preserve"> </w:t>
       </w:r>
       <w:r>
-        <w:t>- Sixty (60) calendar days</w:t>
+        <w:t xml:space="preserve">- </w:t>
+      </w:r>
+      <w:r>
+        <w:t>{{WRITTEN_DATE}}</w:t>
+      </w:r>
+      <w:r>
+        <w:t xml:space="preserve"> calendar days</w:t>
       </w:r>
       <w:r>
         <w:rPr>
@@ -713,7 +719,21 @@
         <w:rPr>
           <w:sz w:val="24"/>
         </w:rPr>
-        <w:t>Four percent (4%) per month, equivalent to forty-eight percent              (48%) per year.</w:t>
+        <w:t xml:space="preserve">Four percent (4%) per month, equivalent to forty-eight percent           </w:t>
+      </w:r>
+      <w:proofErr w:type="gramStart"/>
+      <w:r>
+        <w:rPr>
+          <w:sz w:val="24"/>
+        </w:rPr>
+        <w:t xml:space="preserve">   (</w:t>
+      </w:r>
+      <w:proofErr w:type="gramEnd"/>
+      <w:r>
+        <w:rPr>
+          <w:sz w:val="24"/>
+        </w:rPr>
+        <w:t>48%) per year.</w:t>
       </w:r>
     </w:p>
     <w:p>
@@ -1183,7 +1203,13 @@
         <w:rPr>
           <w:sz w:val="24"/>
         </w:rPr>
-        <w:t xml:space="preserve">Zero Cents </w:t>
+        <w:t>Zero Cents</w:t>
+      </w:r>
+      <w:r>
+        <w:rPr>
+          <w:sz w:val="24"/>
+        </w:rPr>
+        <w:t xml:space="preserve"> </w:t>
       </w:r>
       <w:r>
         <w:rPr>
@@ -1439,22 +1465,28 @@
         <w:t xml:space="preserve"> </w:t>
       </w:r>
       <w:r>
-        <w:t>Five</w:t>
-      </w:r>
-      <w:r>
-        <w:rPr>
-          <w:spacing w:val="-9"/>
-        </w:rPr>
-        <w:t xml:space="preserve"> </w:t>
-      </w:r>
-      <w:r>
-        <w:t xml:space="preserve">Percent </w:t>
-      </w:r>
-      <w:r>
-        <w:rPr>
-          <w:b/>
-        </w:rPr>
-        <w:t>(5%)</w:t>
+        <w:t>{{WRITTEN_PERCENT_RATE}}</w:t>
+      </w:r>
+      <w:r>
+        <w:t xml:space="preserve"> </w:t>
+      </w:r>
+      <w:r>
+        <w:rPr>
+          <w:b/>
+        </w:rPr>
+        <w:t>(</w:t>
+      </w:r>
+      <w:r>
+        <w:rPr>
+          <w:b/>
+        </w:rPr>
+        <w:t>{{PERCENT_RATE}}</w:t>
+      </w:r>
+      <w:r>
+        <w:rPr>
+          <w:b/>
+        </w:rPr>
+        <w:t>)</w:t>
       </w:r>
       <w:r>
         <w:t>,</w:t>
@@ -1481,7 +1513,13 @@
         <w:t>INTEREST_</w:t>
       </w:r>
       <w:r>
-        <w:t xml:space="preserve">WRITTEN_AMOUNT}} </w:t>
+        <w:t>WRITTEN_AMOUNT}}</w:t>
+      </w:r>
+      <w:r>
+        <w:t xml:space="preserve"> dollars</w:t>
+      </w:r>
+      <w:r>
+        <w:t xml:space="preserve"> </w:t>
       </w:r>
       <w:r>
         <w:rPr>
@@ -1578,7 +1616,13 @@
         <w:t>TOTAL_</w:t>
       </w:r>
       <w:r>
-        <w:t xml:space="preserve">WRITTEN_AMOUNT}} </w:t>
+        <w:t>WRITTEN_AMOUNT}}</w:t>
+      </w:r>
+      <w:r>
+        <w:t xml:space="preserve"> dollars</w:t>
+      </w:r>
+      <w:r>
+        <w:t xml:space="preserve"> </w:t>
       </w:r>
       <w:bookmarkStart w:id="6" w:name="_Hlk221116664"/>
       <w:r>
@@ -1592,16 +1636,13 @@
         <w:t xml:space="preserve">. The full loan shall be repaid within </w:t>
       </w:r>
       <w:r>
-        <w:t>sixty</w:t>
-      </w:r>
-      <w:r>
-        <w:t xml:space="preserve"> (</w:t>
-      </w:r>
-      <w:r>
-        <w:t>60</w:t>
-      </w:r>
-      <w:r>
-        <w:t>) days after execution of this note.</w:t>
+        <w:t>{{WRITTEN_DATE}}</w:t>
+      </w:r>
+      <w:r>
+        <w:t xml:space="preserve"> </w:t>
+      </w:r>
+      <w:r>
+        <w:t>days after execution of this note.</w:t>
       </w:r>
     </w:p>
     <w:p>
@@ -1808,26 +1849,13 @@
         <w:jc w:val="both"/>
       </w:pPr>
       <w:r>
-        <w:t xml:space="preserve">If the full loan is not </w:t>
-      </w:r>
-      <w:commentRangeStart w:id="8"/>
-      <w:r>
-        <w:t xml:space="preserve">repaid within </w:t>
-      </w:r>
-      <w:r>
-        <w:t>sixty (60)</w:t>
-      </w:r>
-      <w:r>
-        <w:t xml:space="preserve"> </w:t>
-      </w:r>
-      <w:commentRangeEnd w:id="8"/>
-      <w:r>
-        <w:rPr>
-          <w:rStyle w:val="CommentReference"/>
-          <w:sz w:val="24"/>
-          <w:szCs w:val="24"/>
-        </w:rPr>
-        <w:commentReference w:id="8"/>
+        <w:t xml:space="preserve">If the full loan is not repaid within </w:t>
+      </w:r>
+      <w:r>
+        <w:t>{{WRITTEN_DATE}}</w:t>
+      </w:r>
+      <w:r>
+        <w:t xml:space="preserve"> </w:t>
       </w:r>
       <w:r>
         <w:t xml:space="preserve">days after execution of this note, the borrower shall incur in a Monthly Interest Rate of </w:t>
@@ -1974,8 +2002,8 @@
         </w:tabs>
         <w:ind w:left="599" w:hanging="239"/>
       </w:pPr>
-      <w:bookmarkStart w:id="9" w:name="4._Prepayment"/>
-      <w:bookmarkEnd w:id="9"/>
+      <w:bookmarkStart w:id="8" w:name="4._Prepayment"/>
+      <w:bookmarkEnd w:id="8"/>
       <w:r>
         <w:rPr>
           <w:spacing w:val="-2"/>
@@ -2173,8 +2201,8 @@
         </w:tabs>
         <w:ind w:left="599" w:hanging="239"/>
       </w:pPr>
-      <w:bookmarkStart w:id="10" w:name="5._Governing_Law"/>
-      <w:bookmarkEnd w:id="10"/>
+      <w:bookmarkStart w:id="9" w:name="5._Governing_Law"/>
+      <w:bookmarkEnd w:id="9"/>
       <w:r>
         <w:t>Governing</w:t>
       </w:r>
@@ -2522,8 +2550,8 @@
         <w:pStyle w:val="Heading1"/>
         <w:spacing w:before="52"/>
       </w:pPr>
-      <w:bookmarkStart w:id="11" w:name="Understood_and_Agreed:"/>
-      <w:bookmarkEnd w:id="11"/>
+      <w:bookmarkStart w:id="10" w:name="Understood_and_Agreed:"/>
+      <w:bookmarkEnd w:id="10"/>
       <w:r>
         <w:t>Understood</w:t>
       </w:r>
@@ -2570,8 +2598,8 @@
           <w:sz w:val="24"/>
         </w:rPr>
       </w:pPr>
-      <w:bookmarkStart w:id="12" w:name="Lender:__Dated:_Ricardo_A._Ocando"/>
-      <w:bookmarkEnd w:id="12"/>
+      <w:bookmarkStart w:id="11" w:name="Lender:__Dated:_Ricardo_A._Ocando"/>
+      <w:bookmarkEnd w:id="11"/>
       <w:r>
         <w:rPr>
           <w:b/>
@@ -3060,46 +3088,6 @@
 </w:document>
 </file>
 
-<file path=word/comments.xml><?xml version="1.0" encoding="utf-8"?>
-<w:comments xmlns:wpc="http://schemas.microsoft.com/office/word/2010/wordprocessingCanvas" xmlns:cx="http://schemas.microsoft.com/office/drawing/2014/chartex" xmlns:cx1="http://schemas.microsoft.com/office/drawing/2015/9/8/chartex" xmlns:cx2="http://schemas.microsoft.com/office/drawing/2015/10/21/chartex" xmlns:cx3="http://schemas.microsoft.com/office/drawing/2016/5/9/chartex" xmlns:cx4="http://schemas.microsoft.com/office/drawing/2016/5/10/chartex" xmlns:cx5="http://schemas.microsoft.com/office/drawing/2016/5/11/chartex" xmlns:cx6="http://schemas.microsoft.com/office/drawing/2016/5/12/chartex" xmlns:cx7="http://schemas.microsoft.com/office/drawing/2016/5/13/chartex" xmlns:cx8="http://schemas.microsoft.com/office/drawing/2016/5/14/chartex" xmlns:mc="http://schemas.openxmlformats.org/markup-compatibility/2006" xmlns:aink="http://schemas.microsoft.com/office/drawing/2016/ink" xmlns:am3d="http://schemas.microsoft.com/office/drawing/2017/model3d" xmlns:o="urn:schemas-microsoft-com:office:office" xmlns:oel="http://schemas.microsoft.com/office/2019/extlst" xmlns:r="http://schemas.openxmlformats.org/officeDocument/2006/relationships" xmlns:m="http://schemas.openxmlformats.org/officeDocument/2006/math" xmlns:v="urn:schemas-microsoft-com:vml" xmlns:wp14="http://schemas.microsoft.com/office/word/2010/wordprocessingDrawing" xmlns:wp="http://schemas.openxmlformats.org/drawingml/2006/wordprocessingDrawing" xmlns:w10="urn:schemas-microsoft-com:office:word" xmlns:w="http://schemas.openxmlformats.org/wordprocessingml/2006/main" xmlns:w14="http://schemas.microsoft.com/office/word/2010/wordml" xmlns:w15="http://schemas.microsoft.com/office/word/2012/wordml" xmlns:w16cex="http://schemas.microsoft.com/office/word/2018/wordml/cex" xmlns:w16cid="http://schemas.microsoft.com/office/word/2016/wordml/cid" xmlns:w16="http://schemas.microsoft.com/office/word/2018/wordml" xmlns:w16du="http://schemas.microsoft.com/office/word/2023/wordml/word16du" xmlns:w16sdtdh="http://schemas.microsoft.com/office/word/2020/wordml/sdtdatahash" xmlns:w16sdtfl="http://schemas.microsoft.com/office/word/2024/wordml/sdtformatlock" xmlns:w16se="http://schemas.microsoft.com/office/word/2015/wordml/symex" xmlns:wpg="http://schemas.microsoft.com/office/word/2010/wordprocessingGroup" xmlns:wpi="http://schemas.microsoft.com/office/word/2010/wordprocessingInk" xmlns:wne="http://schemas.microsoft.com/office/word/2006/wordml" xmlns:wps="http://schemas.microsoft.com/office/word/2010/wordprocessingShape" mc:Ignorable="w14 w15 w16se w16cid w16 w16cex w16sdtdh w16sdtfl w16du wp14">
-  <w:comment w:id="8" w:author="JOSE CARLOS AVILA BREVE" w:date="2026-05-18T10:40:00Z" w:initials="JCAB">
-    <w:p>
-      <w:r>
-        <w:rPr>
-          <w:rStyle w:val="CommentReference"/>
-        </w:rPr>
-        <w:annotationRef/>
-      </w:r>
-      <w:r>
-        <w:rPr>
-          <w:sz w:val="20"/>
-          <w:szCs w:val="20"/>
-        </w:rPr>
-        <w:t>Add written amount of days</w:t>
-      </w:r>
-    </w:p>
-  </w:comment>
-</w:comments>
-</file>
-
-<file path=word/commentsExtended.xml><?xml version="1.0" encoding="utf-8"?>
-<w15:commentsEx xmlns:wpc="http://schemas.microsoft.com/office/word/2010/wordprocessingCanvas" xmlns:cx="http://schemas.microsoft.com/office/drawing/2014/chartex" xmlns:cx1="http://schemas.microsoft.com/office/drawing/2015/9/8/chartex" xmlns:cx2="http://schemas.microsoft.com/office/drawing/2015/10/21/chartex" xmlns:cx3="http://schemas.microsoft.com/office/drawing/2016/5/9/chartex" xmlns:cx4="http://schemas.microsoft.com/office/drawing/2016/5/10/chartex" xmlns:cx5="http://schemas.microsoft.com/office/drawing/2016/5/11/chartex" xmlns:cx6="http://schemas.microsoft.com/office/drawing/2016/5/12/chartex" xmlns:cx7="http://schemas.microsoft.com/office/drawing/2016/5/13/chartex" xmlns:cx8="http://schemas.microsoft.com/office/drawing/2016/5/14/chartex" xmlns:mc="http://schemas.openxmlformats.org/markup-compatibility/2006" xmlns:aink="http://schemas.microsoft.com/office/drawing/2016/ink" xmlns:am3d="http://schemas.microsoft.com/office/drawing/2017/model3d" xmlns:o="urn:schemas-microsoft-com:office:office" xmlns:oel="http://schemas.microsoft.com/office/2019/extlst" xmlns:r="http://schemas.openxmlformats.org/officeDocument/2006/relationships" xmlns:m="http://schemas.openxmlformats.org/officeDocument/2006/math" xmlns:v="urn:schemas-microsoft-com:vml" xmlns:wp14="http://schemas.microsoft.com/office/word/2010/wordprocessingDrawing" xmlns:wp="http://schemas.openxmlformats.org/drawingml/2006/wordprocessingDrawing" xmlns:w10="urn:schemas-microsoft-com:office:word" xmlns:w="http://schemas.openxmlformats.org/wordprocessingml/2006/main" xmlns:w14="http://schemas.microsoft.com/office/word/2010/wordml" xmlns:w15="http://schemas.microsoft.com/office/word/2012/wordml" xmlns:w16cex="http://schemas.microsoft.com/office/word/2018/wordml/cex" xmlns:w16cid="http://schemas.microsoft.com/office/word/2016/wordml/cid" xmlns:w16="http://schemas.microsoft.com/office/word/2018/wordml" xmlns:w16du="http://schemas.microsoft.com/office/word/2023/wordml/word16du" xmlns:w16sdtdh="http://schemas.microsoft.com/office/word/2020/wordml/sdtdatahash" xmlns:w16sdtfl="http://schemas.microsoft.com/office/word/2024/wordml/sdtformatlock" xmlns:w16se="http://schemas.microsoft.com/office/word/2015/wordml/symex" xmlns:wpg="http://schemas.microsoft.com/office/word/2010/wordprocessingGroup" xmlns:wpi="http://schemas.microsoft.com/office/word/2010/wordprocessingInk" xmlns:wne="http://schemas.microsoft.com/office/word/2006/wordml" xmlns:wps="http://schemas.microsoft.com/office/word/2010/wordprocessingShape" mc:Ignorable="w14 w15 w16se w16cid w16 w16cex w16sdtdh w16sdtfl w16du wp14">
-  <w15:commentEx w15:paraId="0407A5BE" w15:done="0"/>
-</w15:commentsEx>
-</file>
-
-<file path=word/commentsExtensible.xml><?xml version="1.0" encoding="utf-8"?>
-<w16cex:commentsExtensible xmlns:wpc="http://schemas.microsoft.com/office/word/2010/wordprocessingCanvas" xmlns:cx="http://schemas.microsoft.com/office/drawing/2014/chartex" xmlns:cx1="http://schemas.microsoft.com/office/drawing/2015/9/8/chartex" xmlns:cx2="http://schemas.microsoft.com/office/drawing/2015/10/21/chartex" xmlns:cx3="http://schemas.microsoft.com/office/drawing/2016/5/9/chartex" xmlns:cx4="http://schemas.microsoft.com/office/drawing/2016/5/10/chartex" xmlns:cx5="http://schemas.microsoft.com/office/drawing/2016/5/11/chartex" xmlns:cx6="http://schemas.microsoft.com/office/drawing/2016/5/12/chartex" xmlns:cx7="http://schemas.microsoft.com/office/drawing/2016/5/13/chartex" xmlns:cx8="http://schemas.microsoft.com/office/drawing/2016/5/14/chartex" xmlns:cr="http://schemas.microsoft.com/office/comments/2020/reactions" xmlns:mc="http://schemas.openxmlformats.org/markup-compatibility/2006" xmlns:aink="http://schemas.microsoft.com/office/drawing/2016/ink" xmlns:am3d="http://schemas.microsoft.com/office/drawing/2017/model3d" xmlns:o="urn:schemas-microsoft-com:office:office" xmlns:oel="http://schemas.microsoft.com/office/2019/extlst" xmlns:r="http://schemas.openxmlformats.org/officeDocument/2006/relationships" xmlns:m="http://schemas.openxmlformats.org/officeDocument/2006/math" xmlns:v="urn:schemas-microsoft-com:vml" xmlns:wp14="http://schemas.microsoft.com/office/word/2010/wordprocessingDrawing" xmlns:wp="http://schemas.openxmlformats.org/drawingml/2006/wordprocessingDrawing" xmlns:w10="urn:schemas-microsoft-com:office:word" xmlns:w="http://schemas.openxmlformats.org/wordprocessingml/2006/main" xmlns:w14="http://schemas.microsoft.com/office/word/2010/wordml" xmlns:w15="http://schemas.microsoft.com/office/word/2012/wordml" xmlns:w16cex="http://schemas.microsoft.com/office/word/2018/wordml/cex" xmlns:w16cid="http://schemas.microsoft.com/office/word/2016/wordml/cid" xmlns:w16="http://schemas.microsoft.com/office/word/2018/wordml" xmlns:w16du="http://schemas.microsoft.com/office/word/2023/wordml/word16du" xmlns:w16sdtdh="http://schemas.microsoft.com/office/word/2020/wordml/sdtdatahash" xmlns:w16sdtfl="http://schemas.microsoft.com/office/word/2024/wordml/sdtformatlock" xmlns:w16se="http://schemas.microsoft.com/office/word/2015/wordml/symex" xmlns:wpg="http://schemas.microsoft.com/office/word/2010/wordprocessingGroup" xmlns:wpi="http://schemas.microsoft.com/office/word/2010/wordprocessingInk" xmlns:wne="http://schemas.microsoft.com/office/word/2006/wordml" xmlns:wps="http://schemas.microsoft.com/office/word/2010/wordprocessingShape" mc:Ignorable="w14 w15 w16se w16cid w16 w16cex w16sdtdh w16sdtfl cr w16du wp14">
-  <w16cex:commentExtensible w16cex:durableId="4CC491A5" w16cex:dateUtc="2026-05-18T16:40:00Z"/>
-</w16cex:commentsExtensible>
-</file>
-
-<file path=word/commentsIds.xml><?xml version="1.0" encoding="utf-8"?>
-<w16cid:commentsIds xmlns:wpc="http://schemas.microsoft.com/office/word/2010/wordprocessingCanvas" xmlns:cx="http://schemas.microsoft.com/office/drawing/2014/chartex" xmlns:cx1="http://schemas.microsoft.com/office/drawing/2015/9/8/chartex" xmlns:cx2="http://schemas.microsoft.com/office/drawing/2015/10/21/chartex" xmlns:cx3="http://schemas.microsoft.com/office/drawing/2016/5/9/chartex" xmlns:cx4="http://schemas.microsoft.com/office/drawing/2016/5/10/chartex" xmlns:cx5="http://schemas.microsoft.com/office/drawing/2016/5/11/chartex" xmlns:cx6="http://schemas.microsoft.com/office/drawing/2016/5/12/chartex" xmlns:cx7="http://schemas.microsoft.com/office/drawing/2016/5/13/chartex" xmlns:cx8="http://schemas.microsoft.com/office/drawing/2016/5/14/chartex" xmlns:mc="http://schemas.openxmlformats.org/markup-compatibility/2006" xmlns:aink="http://schemas.microsoft.com/office/drawing/2016/ink" xmlns:am3d="http://schemas.microsoft.com/office/drawing/2017/model3d" xmlns:o="urn:schemas-microsoft-com:office:office" xmlns:oel="http://schemas.microsoft.com/office/2019/extlst" xmlns:r="http://schemas.openxmlformats.org/officeDocument/2006/relationships" xmlns:m="http://schemas.openxmlformats.org/officeDocument/2006/math" xmlns:v="urn:schemas-microsoft-com:vml" xmlns:wp14="http://schemas.microsoft.com/office/word/2010/wordprocessingDrawing" xmlns:wp="http://schemas.openxmlformats.org/drawingml/2006/wordprocessingDrawing" xmlns:w10="urn:schemas-microsoft-com:office:word" xmlns:w="http://schemas.openxmlformats.org/wordprocessingml/2006/main" xmlns:w14="http://schemas.microsoft.com/office/word/2010/wordml" xmlns:w15="http://schemas.microsoft.com/office/word/2012/wordml" xmlns:w16cex="http://schemas.microsoft.com/office/word/2018/wordml/cex" xmlns:w16cid="http://schemas.microsoft.com/office/word/2016/wordml/cid" xmlns:w16="http://schemas.microsoft.com/office/word/2018/wordml" xmlns:w16du="http://schemas.microsoft.com/office/word/2023/wordml/word16du" xmlns:w16sdtdh="http://schemas.microsoft.com/office/word/2020/wordml/sdtdatahash" xmlns:w16sdtfl="http://schemas.microsoft.com/office/word/2024/wordml/sdtformatlock" xmlns:w16se="http://schemas.microsoft.com/office/word/2015/wordml/symex" xmlns:wpg="http://schemas.microsoft.com/office/word/2010/wordprocessingGroup" xmlns:wpi="http://schemas.microsoft.com/office/word/2010/wordprocessingInk" xmlns:wne="http://schemas.microsoft.com/office/word/2006/wordml" xmlns:wps="http://schemas.microsoft.com/office/word/2010/wordprocessingShape" mc:Ignorable="w14 w15 w16se w16cid w16 w16cex w16sdtdh w16sdtfl w16du wp14">
-  <w16cid:commentId w16cid:paraId="0407A5BE" w16cid:durableId="4CC491A5"/>
-</w16cid:commentsIds>
-</file>
-
 <file path=word/numbering.xml><?xml version="1.0" encoding="utf-8"?>
 <w:numbering xmlns:wpc="http://schemas.microsoft.com/office/word/2010/wordprocessingCanvas" xmlns:cx="http://schemas.microsoft.com/office/drawing/2014/chartex" xmlns:cx1="http://schemas.microsoft.com/office/drawing/2015/9/8/chartex" xmlns:cx2="http://schemas.microsoft.com/office/drawing/2015/10/21/chartex" xmlns:cx3="http://schemas.microsoft.com/office/drawing/2016/5/9/chartex" xmlns:cx4="http://schemas.microsoft.com/office/drawing/2016/5/10/chartex" xmlns:cx5="http://schemas.microsoft.com/office/drawing/2016/5/11/chartex" xmlns:cx6="http://schemas.microsoft.com/office/drawing/2016/5/12/chartex" xmlns:cx7="http://schemas.microsoft.com/office/drawing/2016/5/13/chartex" xmlns:cx8="http://schemas.microsoft.com/office/drawing/2016/5/14/chartex" xmlns:mc="http://schemas.openxmlformats.org/markup-compatibility/2006" xmlns:aink="http://schemas.microsoft.com/office/drawing/2016/ink" xmlns:am3d="http://schemas.microsoft.com/office/drawing/2017/model3d" xmlns:o="urn:schemas-microsoft-com:office:office" xmlns:oel="http://schemas.microsoft.com/office/2019/extlst" xmlns:r="http://schemas.openxmlformats.org/officeDocument/2006/relationships" xmlns:m="http://schemas.openxmlformats.org/officeDocument/2006/math" xmlns:v="urn:schemas-microsoft-com:vml" xmlns:wp14="http://schemas.microsoft.com/office/word/2010/wordprocessingDrawing" xmlns:wp="http://schemas.openxmlformats.org/drawingml/2006/wordprocessingDrawing" xmlns:w10="urn:schemas-microsoft-com:office:word" xmlns:w="http://schemas.openxmlformats.org/wordprocessingml/2006/main" xmlns:w14="http://schemas.microsoft.com/office/word/2010/wordml" xmlns:w15="http://schemas.microsoft.com/office/word/2012/wordml" xmlns:w16cex="http://schemas.microsoft.com/office/word/2018/wordml/cex" xmlns:w16cid="http://schemas.microsoft.com/office/word/2016/wordml/cid" xmlns:w16="http://schemas.microsoft.com/office/word/2018/wordml" xmlns:w16du="http://schemas.microsoft.com/office/word/2023/wordml/word16du" xmlns:w16sdtdh="http://schemas.microsoft.com/office/word/2020/wordml/sdtdatahash" xmlns:w16sdtfl="http://schemas.microsoft.com/office/word/2024/wordml/sdtformatlock" xmlns:w16se="http://schemas.microsoft.com/office/word/2015/wordml/symex" xmlns:wpg="http://schemas.microsoft.com/office/word/2010/wordprocessingGroup" xmlns:wpi="http://schemas.microsoft.com/office/word/2010/wordprocessingInk" xmlns:wne="http://schemas.microsoft.com/office/word/2006/wordml" xmlns:wps="http://schemas.microsoft.com/office/word/2010/wordprocessingShape" mc:Ignorable="w14 w15 w16se w16cid w16 w16cex w16sdtdh w16sdtfl w16du wp14">
   <w:abstractNum w:abstractNumId="0" w15:restartNumberingAfterBreak="0">
@@ -3229,14 +3217,6 @@
     <w:abstractNumId w:val="0"/>
   </w:num>
 </w:numbering>
-</file>
-
-<file path=word/people.xml><?xml version="1.0" encoding="utf-8"?>
-<w15:people xmlns:wpc="http://schemas.microsoft.com/office/word/2010/wordprocessingCanvas" xmlns:cx="http://schemas.microsoft.com/office/drawing/2014/chartex" xmlns:cx1="http://schemas.microsoft.com/office/drawing/2015/9/8/chartex" xmlns:cx2="http://schemas.microsoft.com/office/drawing/2015/10/21/chartex" xmlns:cx3="http://schemas.microsoft.com/office/drawing/2016/5/9/chartex" xmlns:cx4="http://schemas.microsoft.com/office/drawing/2016/5/10/chartex" xmlns:cx5="http://schemas.microsoft.com/office/drawing/2016/5/11/chartex" xmlns:cx6="http://schemas.microsoft.com/office/drawing/2016/5/12/chartex" xmlns:cx7="http://schemas.microsoft.com/office/drawing/2016/5/13/chartex" xmlns:cx8="http://schemas.microsoft.com/office/drawing/2016/5/14/chartex" xmlns:mc="http://schemas.openxmlformats.org/markup-compatibility/2006" xmlns:aink="http://schemas.microsoft.com/office/drawing/2016/ink" xmlns:am3d="http://schemas.microsoft.com/office/drawing/2017/model3d" xmlns:o="urn:schemas-microsoft-com:office:office" xmlns:oel="http://schemas.microsoft.com/office/2019/extlst" xmlns:r="http://schemas.openxmlformats.org/officeDocument/2006/relationships" xmlns:m="http://schemas.openxmlformats.org/officeDocument/2006/math" xmlns:v="urn:schemas-microsoft-com:vml" xmlns:wp14="http://schemas.microsoft.com/office/word/2010/wordprocessingDrawing" xmlns:wp="http://schemas.openxmlformats.org/drawingml/2006/wordprocessingDrawing" xmlns:w10="urn:schemas-microsoft-com:office:word" xmlns:w="http://schemas.openxmlformats.org/wordprocessingml/2006/main" xmlns:w14="http://schemas.microsoft.com/office/word/2010/wordml" xmlns:w15="http://schemas.microsoft.com/office/word/2012/wordml" xmlns:w16cex="http://schemas.microsoft.com/office/word/2018/wordml/cex" xmlns:w16cid="http://schemas.microsoft.com/office/word/2016/wordml/cid" xmlns:w16="http://schemas.microsoft.com/office/word/2018/wordml" xmlns:w16du="http://schemas.microsoft.com/office/word/2023/wordml/word16du" xmlns:w16sdtdh="http://schemas.microsoft.com/office/word/2020/wordml/sdtdatahash" xmlns:w16sdtfl="http://schemas.microsoft.com/office/word/2024/wordml/sdtformatlock" xmlns:w16se="http://schemas.microsoft.com/office/word/2015/wordml/symex" xmlns:wpg="http://schemas.microsoft.com/office/word/2010/wordprocessingGroup" xmlns:wpi="http://schemas.microsoft.com/office/word/2010/wordprocessingInk" xmlns:wne="http://schemas.microsoft.com/office/word/2006/wordml" xmlns:wps="http://schemas.microsoft.com/office/word/2010/wordprocessingShape" mc:Ignorable="w14 w15 w16se w16cid w16 w16cex w16sdtdh w16sdtfl w16du wp14">
-  <w15:person w15:author="JOSE CARLOS AVILA BREVE">
-    <w15:presenceInfo w15:providerId="AD" w15:userId="S::jcavilab@unitec.edu::33a2ab00-9bf7-4876-84a0-38d6464c587d"/>
-  </w15:person>
-</w15:people>
 </file>
 
 <file path=word/styles.xml><?xml version="1.0" encoding="utf-8"?>

</xml_diff>